<commit_message>
Cut the Kastle intro to three sentences
Same treatment as ispace: one observation and the overlap, with the
July leadership quote and paddock detail moved to a note.

Co-Authored-By: Claude Opus 5.5 <noreply@anthropic.com>
Claude-Session: https://claude.ai/code/session_011Vvxd2V3zerAfjn84yXuuv
</commit_message>
<xml_diff>
--- a/call-scripts/Kastle-Systems-F1-Conversation-Script.docx
+++ b/call-scripts/Kastle-Systems-F1-Conversation-Script.docx
@@ -398,67 +398,48 @@
           <w:sz w:val="25"/>
           <w:szCs w:val="25"/>
         </w:rPr>
-        <w:t xml:space="preserve">B. Why I reached out (45 to 60 seconds)</w:t>
-      </w:r>
-    </w:p>
-    <w:p>
-      <w:pPr>
-        <w:pBdr>
-          <w:left w:val="single" w:color="2E74B5" w:sz="18" w:space="12"/>
-        </w:pBdr>
-        <w:spacing w:after="60" w:before="60"/>
-        <w:ind w:left="420"/>
-      </w:pPr>
-      <w:r>
-        <w:rPr>
-          <w:color w:val="1F3864"/>
-        </w:rPr>
-        <w:t xml:space="preserve">"So, why Kastle. It started with something Haniel said in July, when you announced the new leadership team. He said the question your customers ask now is 'who do I trust to run this for me?' And that the person asking isn't just the property manager any more. It's the asset manager, the CFO, sometimes the CEO.</w:t>
-      </w:r>
-    </w:p>
-    <w:p>
-      <w:pPr>
-        <w:pBdr>
-          <w:left w:val="single" w:color="2E74B5" w:sz="18" w:space="12"/>
-        </w:pBdr>
-        <w:spacing w:after="60" w:before="60"/>
-        <w:ind w:left="420"/>
-      </w:pPr>
-      <w:r>
-        <w:rPr>
-          <w:color w:val="1F3864"/>
-        </w:rPr>
-        <w:t xml:space="preserve">What's interesting is that's a different sale. You're not selling badge readers to the person who runs a building. You're asking the person who owns it to trust you with the whole portfolio.</w:t>
-      </w:r>
-    </w:p>
-    <w:p>
-      <w:pPr>
-        <w:pBdr>
-          <w:left w:val="single" w:color="2E74B5" w:sz="18" w:space="12"/>
-        </w:pBdr>
-        <w:spacing w:after="60" w:before="60"/>
-        <w:ind w:left="420"/>
-      </w:pPr>
-      <w:r>
-        <w:rPr>
-          <w:color w:val="1F3864"/>
-        </w:rPr>
-        <w:t xml:space="preserve">And the world I work in runs on the same idea you do. Nobody gets into a Formula 1 paddock without a pass, and every pass decides which door opens. The paddock, the garage, the hospitality. Who gets in, where, and when. It's your business, running flat out for three days.</w:t>
-      </w:r>
-    </w:p>
-    <w:p>
-      <w:pPr>
-        <w:pBdr>
-          <w:left w:val="single" w:color="2E74B5" w:sz="18" w:space="12"/>
-        </w:pBdr>
-        <w:spacing w:after="60" w:before="60"/>
-        <w:ind w:left="420"/>
-      </w:pPr>
-      <w:r>
-        <w:rPr>
-          <w:color w:val="1F3864"/>
-        </w:rPr>
-        <w:t xml:space="preserve">And, you know, at the American races, the people walking around with those passes look a lot like the people Haniel was talking about. That's why I got in touch."</w:t>
+        <w:t xml:space="preserve">B. Why I reached out (20 to 30 seconds)</w:t>
+      </w:r>
+    </w:p>
+    <w:p>
+      <w:pPr>
+        <w:spacing w:after="80" w:before="80"/>
+      </w:pPr>
+      <w:r>
+        <w:rPr>
+          <w:i/>
+          <w:iCs/>
+          <w:color w:val="7F7F7F"/>
+        </w:rPr>
+        <w:t xml:space="preserve">[Two or three sentences, then stop. It's an observation, not a pitch.]</w:t>
+      </w:r>
+    </w:p>
+    <w:p>
+      <w:pPr>
+        <w:pBdr>
+          <w:left w:val="single" w:color="2E74B5" w:sz="18" w:space="12"/>
+        </w:pBdr>
+        <w:spacing w:after="60" w:before="60"/>
+        <w:ind w:left="420"/>
+      </w:pPr>
+      <w:r>
+        <w:rPr>
+          <w:color w:val="1F3864"/>
+        </w:rPr>
+        <w:t xml:space="preserve">"So, why Kastle. Doing the research, what struck me is that your whole business comes down to trust: who gets in, where, and when, and who an owner trusts to run all of that for them. That's exactly how a Formula 1 paddock works, and the people walking around it at the US races look a lot like the owners and CFOs you're selling to now, so it felt worth a conversation."</w:t>
+      </w:r>
+    </w:p>
+    <w:p>
+      <w:pPr>
+        <w:spacing w:after="80" w:before="80"/>
+      </w:pPr>
+      <w:r>
+        <w:rPr>
+          <w:i/>
+          <w:iCs/>
+          <w:color w:val="7F7F7F"/>
+        </w:rPr>
+        <w:t xml:space="preserve">[Only if they ask for more. Where it came from: in July, when they announced the new leadership team, Haniel said the question customers ask now is "who do I trust to run this for me?", and that the buyer isn't just the property manager any more but the asset manager, the CFO, sometimes the CEO. At a race, every pass decides which door opens: the paddock, the garage, the hospitality. It's their business, running flat out for three days.]</w:t>
       </w:r>
     </w:p>
     <w:p>

</xml_diff>